<commit_message>
Tighten report: shorter sections, informal natural tone
</commit_message>
<xml_diff>
--- a/Network_Performance_Analyzer_Report.docx
+++ b/Network_Performance_Analyzer_Report.docx
@@ -479,7 +479,7 @@
           <w:sz w:val="25"/>
           <w:szCs w:val="25"/>
         </w:rPr>
-        <w:t xml:space="preserve">1.1 Introduction</w:t>
+        <w:t xml:space="preserve">1.1 What This Project Is About</w:t>
       </w:r>
     </w:p>
     <w:p>
@@ -494,7 +494,7 @@
           <w:sz w:val="22"/>
           <w:szCs w:val="22"/>
         </w:rPr>
-        <w:t xml:space="preserve">When a network gets busy, packets wait. Every router has a buffer, and once traffic gets close to what a link can handle, that buffer starts filling up. Delay grows. Packets get dropped. Throughput stops improving. This project is about seeing exactly how and when that happens.</w:t>
+        <w:t xml:space="preserve">Networks slow down when they get busy. Packets pile up in router buffers, delay climbs, and past a point packets just get thrown away. We wanted to actually watch this happen instead of only reading formulas about it.</w:t>
       </w:r>
     </w:p>
     <w:p>
@@ -509,7 +509,7 @@
           <w:sz w:val="22"/>
           <w:szCs w:val="22"/>
         </w:rPr>
-        <w:t xml:space="preserve">We built a Python tool that simulates packet queues, measures throughput, delay and packet loss, and checks every number against what queuing theory predicts. It also compares TCP and UDP on the same overloaded network. The idea is simple: if the simulation and the maths agree, we can trust both.</w:t>
+        <w:t xml:space="preserve">So we built a Python tool that simulates packet queues, measures throughput, delay and packet loss, and checks every number against what queuing theory says it should be. It also shows how TCP and UDP react when you overload the same link. If the simulation and the maths agree, we can trust both. They do.</w:t>
       </w:r>
     </w:p>
     <w:p>
@@ -526,7 +526,7 @@
           <w:sz w:val="25"/>
           <w:szCs w:val="25"/>
         </w:rPr>
-        <w:t xml:space="preserve">1.2 Problem Statement</w:t>
+        <w:t xml:space="preserve">1.2 The Problem</w:t>
       </w:r>
     </w:p>
     <w:p>
@@ -541,7 +541,7 @@
           <w:sz w:val="22"/>
           <w:szCs w:val="22"/>
         </w:rPr>
-        <w:t xml:space="preserve">Testing on real hardware is expensive and almost impossible to repeat exactly. Formulas are exact but only cover idealised cases — they say nothing about a buffer actually overflowing. We wanted something in between: a simulator that behaves like a real queue, packet by packet, but verifies itself against theory.</w:t>
+        <w:t xml:space="preserve">Real hardware is expensive and no two test runs come out the same. Formulas are exact but too clean — they can't show a buffer actually overflowing. We wanted the middle ground: a simulator that behaves like a real queue, packet by packet, but proves itself against the maths.</w:t>
       </w:r>
     </w:p>
     <w:p>
@@ -577,7 +577,7 @@
           <w:sz w:val="22"/>
           <w:szCs w:val="22"/>
         </w:rPr>
-        <w:t xml:space="preserve">Simulate single-server (M/M/1) and multi-server (M/M/c) queue models.</w:t>
+        <w:t xml:space="preserve">Simulate M/M/1, M/M/c and finite-buffer M/M/c/K queues.</w:t>
       </w:r>
     </w:p>
     <w:p>
@@ -596,7 +596,7 @@
           <w:sz w:val="22"/>
           <w:szCs w:val="22"/>
         </w:rPr>
-        <w:t xml:space="preserve">Validate the simulation against Little's Law and the Erlang-C formula.</w:t>
+        <w:t xml:space="preserve">Check the simulation against Little's Law and Erlang-C.</w:t>
       </w:r>
     </w:p>
     <w:p>
@@ -615,7 +615,7 @@
           <w:sz w:val="22"/>
           <w:szCs w:val="22"/>
         </w:rPr>
-        <w:t xml:space="preserve">Measure throughput, average delay and packet loss under different loads.</w:t>
+        <w:t xml:space="preserve">Measure throughput, delay and packet loss at different loads.</w:t>
       </w:r>
     </w:p>
     <w:p>
@@ -634,7 +634,7 @@
           <w:sz w:val="22"/>
           <w:szCs w:val="22"/>
         </w:rPr>
-        <w:t xml:space="preserve">Compare TCP and UDP behaviour as traffic increases.</w:t>
+        <w:t xml:space="preserve">Compare TCP and UDP as traffic grows.</w:t>
       </w:r>
     </w:p>
     <w:p>
@@ -653,7 +653,7 @@
           <w:sz w:val="22"/>
           <w:szCs w:val="22"/>
         </w:rPr>
-        <w:t xml:space="preserve">Find which queue configuration handles a given load best.</w:t>
+        <w:t xml:space="preserve">Figure out which setup handles a given load best.</w:t>
       </w:r>
     </w:p>
     <w:p>
@@ -685,7 +685,7 @@
           <w:sz w:val="22"/>
           <w:szCs w:val="22"/>
         </w:rPr>
-        <w:t xml:space="preserve">The tool is aimed at students learning performance engineering. It runs three ways: an interactive web dashboard, a menu-driven command-line program, and a Google Colab notebook that needs no setup at all. Every result and every graph in this report can be reproduced in minutes.</w:t>
+        <w:t xml:space="preserve">Made for students learning performance engineering. It runs three ways — a web dashboard, a command-line menu, and a Colab notebook that needs zero setup. Every graph in this report can be reproduced in minutes.</w:t>
       </w:r>
     </w:p>
     <w:p>
@@ -745,7 +745,7 @@
           <w:sz w:val="25"/>
           <w:szCs w:val="25"/>
         </w:rPr>
-        <w:t xml:space="preserve">2.1 Queuing Theory</w:t>
+        <w:t xml:space="preserve">2.1 Queuing Theory, Quickly</w:t>
       </w:r>
     </w:p>
     <w:p>
@@ -760,7 +760,7 @@
           <w:sz w:val="22"/>
           <w:szCs w:val="22"/>
         </w:rPr>
-        <w:t xml:space="preserve">Queuing theory is the maths of waiting lines. M/M/1 means Poisson arrivals, exponential service, one server. Add servers and you get M/M/c; cap the buffer at K packets and you get M/M/c/K, which is where packet loss appears. Two classic results tie it together: Little's Law (L = λ·W) links the number of packets in the system to the time each spends there, and Erlang-C gives the chance an arriving packet has to wait. Both are exact, which makes them perfect for checking a simulator.</w:t>
+        <w:t xml:space="preserve">Queuing theory is the maths of waiting lines. M/M/1 means Poisson arrivals, exponential service, one server. M/M/c adds servers. M/M/c/K caps the buffer at K packets — that cap is where packet loss comes from. Two results do the heavy lifting for us: Little's Law (L = λ·W) ties the number of packets in the system to the time each one spends there, and Erlang-C gives the chance a packet has to wait. Both are exact. That makes them perfect for checking a simulator.</w:t>
       </w:r>
     </w:p>
     <w:p>
@@ -792,7 +792,7 @@
           <w:sz w:val="22"/>
           <w:szCs w:val="22"/>
         </w:rPr>
-        <w:t xml:space="preserve">A discrete-event simulator does not tick a clock forward in fixed steps. It jumps from one event to the next — a packet arrives, a server frees up, a packet leaves. SimPy handles the scheduling. The payoff is detail: the simulator drops packets from a full buffer just like a real router, which is exactly what the formulas alone cannot describe.</w:t>
+        <w:t xml:space="preserve">A discrete-event simulator doesn't tick a clock. It jumps between events — packet arrives, server frees up, packet leaves — and SimPy handles all the scheduling. The payoff is realism: it drops packets from a full buffer exactly like a real router would, which is the one thing formulas can't show you.</w:t>
       </w:r>
     </w:p>
     <w:p>
@@ -809,7 +809,7 @@
           <w:sz w:val="25"/>
           <w:szCs w:val="25"/>
         </w:rPr>
-        <w:t xml:space="preserve">2.3 Tools and Libraries</w:t>
+        <w:t xml:space="preserve">2.3 Tools</w:t>
       </w:r>
     </w:p>
     <w:tbl>
@@ -996,7 +996,7 @@
                 <w:sz w:val="21"/>
                 <w:szCs w:val="21"/>
               </w:rPr>
-              <w:t xml:space="preserve">Discrete-event simulation of queues and servers</w:t>
+              <w:t xml:space="preserve">Discrete-event queue simulation</w:t>
             </w:r>
           </w:p>
         </w:tc>
@@ -1052,7 +1052,7 @@
                 <w:sz w:val="21"/>
                 <w:szCs w:val="21"/>
               </w:rPr>
-              <w:t xml:space="preserve">Random inter-arrival and service times</w:t>
+              <w:t xml:space="preserve">Random arrival and service times</w:t>
             </w:r>
           </w:p>
         </w:tc>
@@ -1108,7 +1108,7 @@
                 <w:sz w:val="21"/>
                 <w:szCs w:val="21"/>
               </w:rPr>
-              <w:t xml:space="preserve">Theoretical formulas</w:t>
+              <w:t xml:space="preserve">The theory formulas</w:t>
             </w:r>
           </w:p>
         </w:tc>
@@ -1164,7 +1164,7 @@
                 <w:sz w:val="21"/>
                 <w:szCs w:val="21"/>
               </w:rPr>
-              <w:t xml:space="preserve">Per-packet records and metric tables</w:t>
+              <w:t xml:space="preserve">Per-packet logs and tables</w:t>
             </w:r>
           </w:p>
         </w:tc>
@@ -1276,7 +1276,7 @@
                 <w:sz w:val="21"/>
                 <w:szCs w:val="21"/>
               </w:rPr>
-              <w:t xml:space="preserve">Interactive web dashboard</w:t>
+              <w:t xml:space="preserve">Web dashboard</w:t>
             </w:r>
           </w:p>
         </w:tc>
@@ -1296,7 +1296,7 @@
           <w:sz w:val="19"/>
           <w:szCs w:val="19"/>
         </w:rPr>
-        <w:t xml:space="preserve">Table 2.1: Tools used and what each one does</w:t>
+        <w:t xml:space="preserve">Table 2.1: What we used and why</w:t>
       </w:r>
     </w:p>
     <w:p>
@@ -1356,7 +1356,7 @@
           <w:sz w:val="25"/>
           <w:szCs w:val="25"/>
         </w:rPr>
-        <w:t xml:space="preserve">3.1 Functional Requirements</w:t>
+        <w:t xml:space="preserve">3.1 What It Has To Do</w:t>
       </w:r>
     </w:p>
     <w:p>
@@ -1375,7 +1375,7 @@
           <w:sz w:val="22"/>
           <w:szCs w:val="22"/>
         </w:rPr>
-        <w:t xml:space="preserve">Generate Poisson packet arrivals at a chosen rate.</w:t>
+        <w:t xml:space="preserve">Generate Poisson arrivals at any chosen rate.</w:t>
       </w:r>
     </w:p>
     <w:p>
@@ -1394,7 +1394,7 @@
           <w:sz w:val="22"/>
           <w:szCs w:val="22"/>
         </w:rPr>
-        <w:t xml:space="preserve">Simulate M/M/1, M/M/c and finite-capacity M/M/c/K queues, dropping packets when the buffer is full.</w:t>
+        <w:t xml:space="preserve">Simulate all three queue models and drop packets when the buffer is full.</w:t>
       </w:r>
     </w:p>
     <w:p>
@@ -1413,7 +1413,7 @@
           <w:sz w:val="22"/>
           <w:szCs w:val="22"/>
         </w:rPr>
-        <w:t xml:space="preserve">Compute throughput, delay, packet loss and utilisation, and compare each against theory.</w:t>
+        <w:t xml:space="preserve">Compute throughput, delay, loss and utilisation, and compare each with theory.</w:t>
       </w:r>
     </w:p>
     <w:p>
@@ -1432,7 +1432,7 @@
           <w:sz w:val="22"/>
           <w:szCs w:val="22"/>
         </w:rPr>
-        <w:t xml:space="preserve">Compare TCP and UDP under rising load and plot all results.</w:t>
+        <w:t xml:space="preserve">Sweep TCP vs UDP across rising load and plot everything.</w:t>
       </w:r>
     </w:p>
     <w:p>
@@ -1449,7 +1449,7 @@
           <w:sz w:val="25"/>
           <w:szCs w:val="25"/>
         </w:rPr>
-        <w:t xml:space="preserve">3.2 Non-Functional Requirements</w:t>
+        <w:t xml:space="preserve">3.2 How Well It Has To Do It</w:t>
       </w:r>
     </w:p>
     <w:p>
@@ -1468,7 +1468,7 @@
           <w:sz w:val="22"/>
           <w:szCs w:val="22"/>
         </w:rPr>
-        <w:t xml:space="preserve">Accuracy: results within a few percent of theory.</w:t>
+        <w:t xml:space="preserve">Accuracy: within a few percent of theory.</w:t>
       </w:r>
     </w:p>
     <w:p>
@@ -1487,7 +1487,7 @@
           <w:sz w:val="22"/>
           <w:szCs w:val="22"/>
         </w:rPr>
-        <w:t xml:space="preserve">Reproducibility: the same seed gives the same result, every time.</w:t>
+        <w:t xml:space="preserve">Reproducibility: same seed, same result, every time.</w:t>
       </w:r>
     </w:p>
     <w:p>
@@ -1506,7 +1506,7 @@
           <w:sz w:val="22"/>
           <w:szCs w:val="22"/>
         </w:rPr>
-        <w:t xml:space="preserve">Usability: simple sliders and menus; runs on any OS or in the browser.</w:t>
+        <w:t xml:space="preserve">Simplicity: sliders and menus, runs anywhere including the browser.</w:t>
       </w:r>
     </w:p>
     <w:p>
@@ -1898,7 +1898,7 @@
           <w:sz w:val="19"/>
           <w:szCs w:val="19"/>
         </w:rPr>
-        <w:t xml:space="preserve">Table 3.1: Hardware and software needed</w:t>
+        <w:t xml:space="preserve">Table 3.1: Hardware and software</w:t>
       </w:r>
     </w:p>
     <w:p>
@@ -1958,7 +1958,7 @@
           <w:sz w:val="25"/>
           <w:szCs w:val="25"/>
         </w:rPr>
-        <w:t xml:space="preserve">4.1 System Architecture</w:t>
+        <w:t xml:space="preserve">4.1 Architecture</w:t>
       </w:r>
     </w:p>
     <w:p>
@@ -1973,7 +1973,7 @@
           <w:sz w:val="22"/>
           <w:szCs w:val="22"/>
         </w:rPr>
-        <w:t xml:space="preserve">The system is a pipeline of small modules. Each does one job and hands simple data to the next, so the simulation, the maths and the plotting stay completely separate.</w:t>
+        <w:t xml:space="preserve">The whole thing is a pipeline of small modules. Each does one job and passes plain data to the next, so the simulation, the maths and the plotting never get tangled up.</w:t>
       </w:r>
     </w:p>
     <w:p>
@@ -2036,24 +2036,7 @@
           <w:sz w:val="19"/>
           <w:szCs w:val="19"/>
         </w:rPr>
-        <w:t xml:space="preserve">Figure 4.1: The seven-stage pipeline of the analyzer</w:t>
-      </w:r>
-    </w:p>
-    <w:p>
-      <w:pPr>
-        <w:pStyle w:val="Heading2"/>
-        <w:spacing w:after="80" w:before="200"/>
-      </w:pPr>
-      <w:r>
-        <w:rPr>
-          <w:rFonts w:ascii="Cambria" w:cs="Cambria" w:eastAsia="Cambria" w:hAnsi="Cambria"/>
-          <w:b/>
-          <w:bCs/>
-          <w:color w:val="000000"/>
-          <w:sz w:val="25"/>
-          <w:szCs w:val="25"/>
-        </w:rPr>
-        <w:t xml:space="preserve">4.2 Modules</w:t>
+        <w:t xml:space="preserve">Figure 4.1: The seven-stage pipeline</w:t>
       </w:r>
     </w:p>
     <w:tbl>
@@ -2128,7 +2111,7 @@
                 <w:sz w:val="21"/>
                 <w:szCs w:val="21"/>
               </w:rPr>
-              <w:t xml:space="preserve">Responsibility</w:t>
+              <w:t xml:space="preserve">Job</w:t>
             </w:r>
           </w:p>
         </w:tc>
@@ -2184,7 +2167,7 @@
                 <w:sz w:val="21"/>
                 <w:szCs w:val="21"/>
               </w:rPr>
-              <w:t xml:space="preserve">Poisson arrivals and exponential service times</w:t>
+              <w:t xml:space="preserve">Poisson arrivals, exponential service times</w:t>
             </w:r>
           </w:p>
         </w:tc>
@@ -2240,7 +2223,7 @@
                 <w:sz w:val="21"/>
                 <w:szCs w:val="21"/>
               </w:rPr>
-              <w:t xml:space="preserve">SimPy simulator for all three queue models</w:t>
+              <w:t xml:space="preserve">SimPy simulator for all three models</w:t>
             </w:r>
           </w:p>
         </w:tc>
@@ -2296,7 +2279,7 @@
                 <w:sz w:val="21"/>
                 <w:szCs w:val="21"/>
               </w:rPr>
-              <w:t xml:space="preserve">Little's Law, Erlang-C and the M/M/c/K solution</w:t>
+              <w:t xml:space="preserve">Little's Law, Erlang-C, M/M/c/K solution</w:t>
             </w:r>
           </w:p>
         </w:tc>
@@ -2352,7 +2335,7 @@
                 <w:sz w:val="21"/>
                 <w:szCs w:val="21"/>
               </w:rPr>
-              <w:t xml:space="preserve">Metrics plus the simulation-vs-theory table</w:t>
+              <w:t xml:space="preserve">Metrics + the simulation-vs-theory table</w:t>
             </w:r>
           </w:p>
         </w:tc>
@@ -2408,7 +2391,7 @@
                 <w:sz w:val="21"/>
                 <w:szCs w:val="21"/>
               </w:rPr>
-              <w:t xml:space="preserve">TCP versus UDP under load</w:t>
+              <w:t xml:space="preserve">TCP vs UDP under load</w:t>
             </w:r>
           </w:p>
         </w:tc>
@@ -2464,7 +2447,7 @@
                 <w:sz w:val="21"/>
                 <w:szCs w:val="21"/>
               </w:rPr>
-              <w:t xml:space="preserve">All Matplotlib graphs</w:t>
+              <w:t xml:space="preserve">All graphs</w:t>
             </w:r>
           </w:p>
         </w:tc>
@@ -2484,7 +2467,7 @@
           <w:sz w:val="19"/>
           <w:szCs w:val="19"/>
         </w:rPr>
-        <w:t xml:space="preserve">Table 4.1: Modules and their responsibilities</w:t>
+        <w:t xml:space="preserve">Table 4.1: Modules</w:t>
       </w:r>
     </w:p>
     <w:p>
@@ -2501,7 +2484,7 @@
           <w:sz w:val="25"/>
           <w:szCs w:val="25"/>
         </w:rPr>
-        <w:t xml:space="preserve">4.3 How the Engine Works</w:t>
+        <w:t xml:space="preserve">4.2 How the Engine Works</w:t>
       </w:r>
     </w:p>
     <w:p>
@@ -2516,7 +2499,7 @@
           <w:sz w:val="22"/>
           <w:szCs w:val="22"/>
         </w:rPr>
-        <w:t xml:space="preserve">The core is a SimPy resource with capacity c — the server pool. Packets arrive with exponential gaps, ask for a server, hold it for an exponential service time, and leave. If the system already holds K packets, a new arrival is simply dropped. That one rule is the whole model of buffer overflow. Every packet is logged (arrival, wait, total time, served or dropped), the log becomes a Pandas table, and the metrics fall out from there. Seeded random numbers make every run repeatable.</w:t>
+        <w:t xml:space="preserve">The core is a SimPy resource with c servers. Packets show up with random exponential gaps, grab a server, hold it for a random service time, and leave. System already full? The new packet is dropped. That single rule is our whole model of buffer overflow, and it's enough. Every packet gets logged — when it came, how long it waited, whether it survived — and the metrics fall straight out of that log. Same seed, same result, every single time.</w:t>
       </w:r>
     </w:p>
     <w:p>
@@ -2533,7 +2516,7 @@
           <w:sz w:val="25"/>
           <w:szCs w:val="25"/>
         </w:rPr>
-        <w:t xml:space="preserve">4.4 Deployment</w:t>
+        <w:t xml:space="preserve">4.3 Deployment</w:t>
       </w:r>
     </w:p>
     <w:p>
@@ -2548,7 +2531,7 @@
           <w:sz w:val="22"/>
           <w:szCs w:val="22"/>
         </w:rPr>
-        <w:t xml:space="preserve">Everything lives in a public GitHub repository. The dashboard is hosted at network-performance-analyzer.streamlit.app and the notebook opens straight into Google Colab. Push a change to main and the live app rebuilds itself. Nobody needs to install anything.</w:t>
+        <w:t xml:space="preserve">Everything is on GitHub. The dashboard runs live at network-performance-analyzer.streamlit.app, the notebook opens straight in Colab, and pushing to main redeploys the app automatically. Nothing to install.</w:t>
       </w:r>
     </w:p>
     <w:p>
@@ -2684,7 +2667,7 @@
                 <w:sz w:val="21"/>
                 <w:szCs w:val="21"/>
               </w:rPr>
-              <w:t xml:space="preserve">Expected Result</w:t>
+              <w:t xml:space="preserve">Expected</w:t>
             </w:r>
           </w:p>
         </w:tc>
@@ -2741,7 +2724,7 @@
                 <w:sz w:val="21"/>
                 <w:szCs w:val="21"/>
               </w:rPr>
-              <w:t xml:space="preserve">M/M/1 simulation vs theory</w:t>
+              <w:t xml:space="preserve">M/M/1 vs theory</w:t>
             </w:r>
           </w:p>
         </w:tc>
@@ -2768,7 +2751,7 @@
                 <w:sz w:val="21"/>
                 <w:szCs w:val="21"/>
               </w:rPr>
-              <w:t xml:space="preserve">Metrics match within about 2%</w:t>
+              <w:t xml:space="preserve">Match within ~2%</w:t>
             </w:r>
           </w:p>
         </w:tc>
@@ -2824,7 +2807,7 @@
                 <w:sz w:val="21"/>
                 <w:szCs w:val="21"/>
               </w:rPr>
-              <w:t xml:space="preserve">M/M/c simulation vs theory</w:t>
+              <w:t xml:space="preserve">M/M/c vs theory</w:t>
             </w:r>
           </w:p>
         </w:tc>
@@ -2851,7 +2834,7 @@
                 <w:sz w:val="21"/>
                 <w:szCs w:val="21"/>
               </w:rPr>
-              <w:t xml:space="preserve">Matches Erlang-C results</w:t>
+              <w:t xml:space="preserve">Matches Erlang-C</w:t>
             </w:r>
           </w:p>
         </w:tc>
@@ -2990,7 +2973,7 @@
                 <w:sz w:val="21"/>
                 <w:szCs w:val="21"/>
               </w:rPr>
-              <w:t xml:space="preserve">TCP vs UDP load sweep</w:t>
+              <w:t xml:space="preserve">TCP vs UDP sweep</w:t>
             </w:r>
           </w:p>
         </w:tc>
@@ -3017,7 +3000,7 @@
                 <w:sz w:val="21"/>
                 <w:szCs w:val="21"/>
               </w:rPr>
-              <w:t xml:space="preserve">Curves follow the expected trade-off</w:t>
+              <w:t xml:space="preserve">Expected trade-off appears</w:t>
             </w:r>
           </w:p>
         </w:tc>
@@ -3073,7 +3056,7 @@
                 <w:sz w:val="21"/>
                 <w:szCs w:val="21"/>
               </w:rPr>
-              <w:t xml:space="preserve">Web dashboard and notebook</w:t>
+              <w:t xml:space="preserve">Dashboard and notebook</w:t>
             </w:r>
           </w:p>
         </w:tc>
@@ -3100,7 +3083,7 @@
                 <w:sz w:val="21"/>
                 <w:szCs w:val="21"/>
               </w:rPr>
-              <w:t xml:space="preserve">Run correctly end to end</w:t>
+              <w:t xml:space="preserve">Run end to end</w:t>
             </w:r>
           </w:p>
         </w:tc>
@@ -3147,7 +3130,7 @@
           <w:sz w:val="19"/>
           <w:szCs w:val="19"/>
         </w:rPr>
-        <w:t xml:space="preserve">Table 5.1: Test cases and outcomes</w:t>
+        <w:t xml:space="preserve">Table 5.1: Tests and outcomes</w:t>
       </w:r>
     </w:p>
     <w:p>
@@ -3164,7 +3147,7 @@
           <w:sz w:val="25"/>
           <w:szCs w:val="25"/>
         </w:rPr>
-        <w:t xml:space="preserve">5.2 Simulation versus Theory</w:t>
+        <w:t xml:space="preserve">5.2 Simulation vs Theory</w:t>
       </w:r>
     </w:p>
     <w:p>
@@ -3179,7 +3162,7 @@
           <w:sz w:val="22"/>
           <w:szCs w:val="22"/>
         </w:rPr>
-        <w:t xml:space="preserve">This is the heart of the project. Every scenario prints its measured metrics next to the analytical ones. The numbers below come from actual runs.</w:t>
+        <w:t xml:space="preserve">This is the heart of the project. Every run prints its measured numbers next to the maths. These came from actual runs:</w:t>
       </w:r>
     </w:p>
     <w:tbl>
@@ -3312,7 +3295,7 @@
                 <w:sz w:val="21"/>
                 <w:szCs w:val="21"/>
               </w:rPr>
-              <w:t xml:space="preserve">Abs. Error</w:t>
+              <w:t xml:space="preserve">Error</w:t>
             </w:r>
           </w:p>
         </w:tc>
@@ -3451,7 +3434,7 @@
                 <w:sz w:val="21"/>
                 <w:szCs w:val="21"/>
               </w:rPr>
-              <w:t xml:space="preserve">M/M/1 - Average delay W (s)</w:t>
+              <w:t xml:space="preserve">M/M/1 - Avg delay W (s)</w:t>
             </w:r>
           </w:p>
         </w:tc>
@@ -3561,7 +3544,7 @@
                 <w:sz w:val="21"/>
                 <w:szCs w:val="21"/>
               </w:rPr>
-              <w:t xml:space="preserve">M/M/2 - Average delay W (s)</w:t>
+              <w:t xml:space="preserve">M/M/2 - Avg delay W (s)</w:t>
             </w:r>
           </w:p>
         </w:tc>
@@ -3882,7 +3865,7 @@
           <w:sz w:val="19"/>
           <w:szCs w:val="19"/>
         </w:rPr>
-        <w:t xml:space="preserve">Table 5.2: Measured results against theoretical values</w:t>
+        <w:t xml:space="preserve">Table 5.2: Measured vs theoretical</w:t>
       </w:r>
     </w:p>
     <w:p>
@@ -3899,7 +3882,7 @@
           <w:sz w:val="25"/>
           <w:szCs w:val="25"/>
         </w:rPr>
-        <w:t xml:space="preserve">5.3 Output Graphs</w:t>
+        <w:t xml:space="preserve">5.3 Graphs</w:t>
       </w:r>
     </w:p>
     <w:p>
@@ -3962,7 +3945,7 @@
           <w:sz w:val="19"/>
           <w:szCs w:val="19"/>
         </w:rPr>
-        <w:t xml:space="preserve">Figure 5.1: Load sweep for M/M/1. The dots (simulation) sit on the line (theory); delay shoots up as ρ nears 1.</w:t>
+        <w:t xml:space="preserve">Figure 5.1: M/M/1 load sweep. Dots are simulation, lines are theory. Delay explodes as ρ nears 1.</w:t>
       </w:r>
     </w:p>
     <w:p>
@@ -4025,7 +4008,7 @@
           <w:sz w:val="19"/>
           <w:szCs w:val="19"/>
         </w:rPr>
-        <w:t xml:space="preserve">Figure 5.2: TCP versus UDP as load increases: goodput, delay and packet loss.</w:t>
+        <w:t xml:space="preserve">Figure 5.2: TCP vs UDP — goodput, delay and loss as load rises.</w:t>
       </w:r>
     </w:p>
     <w:p>
@@ -4088,7 +4071,7 @@
           <w:sz w:val="19"/>
           <w:szCs w:val="19"/>
         </w:rPr>
-        <w:t xml:space="preserve">Figure 5.3: Adding servers keeps delay low at the same per-server load.</w:t>
+        <w:t xml:space="preserve">Figure 5.3: More servers, less delay at the same per-server load.</w:t>
       </w:r>
     </w:p>
     <w:p>
@@ -4105,7 +4088,7 @@
           <w:sz w:val="25"/>
           <w:szCs w:val="25"/>
         </w:rPr>
-        <w:t xml:space="preserve">5.4 What the Results Show</w:t>
+        <w:t xml:space="preserve">5.4 What We Found</w:t>
       </w:r>
     </w:p>
     <w:p>
@@ -4124,7 +4107,7 @@
           <w:sz w:val="22"/>
           <w:szCs w:val="22"/>
         </w:rPr>
-        <w:t xml:space="preserve">Simulation and theory agree to within about 1-2% on every metric.</w:t>
+        <w:t xml:space="preserve">Simulation and theory agree within 1-2% everywhere we checked.</w:t>
       </w:r>
     </w:p>
     <w:p>
@@ -4143,7 +4126,7 @@
           <w:sz w:val="22"/>
           <w:szCs w:val="22"/>
         </w:rPr>
-        <w:t xml:space="preserve">Delay stays flat at light load, then explodes as ρ approaches 1 — the queuing knee.</w:t>
+        <w:t xml:space="preserve">Delay stays flat, then explodes as ρ approaches 1. That's the queuing knee.</w:t>
       </w:r>
     </w:p>
     <w:p>
@@ -4162,7 +4145,7 @@
           <w:sz w:val="22"/>
           <w:szCs w:val="22"/>
         </w:rPr>
-        <w:t xml:space="preserve">Two or three servers keep delay far lower than one at the same per-server load.</w:t>
+        <w:t xml:space="preserve">Two or three servers beat one server badly at the same per-server load.</w:t>
       </w:r>
     </w:p>
     <w:p>
@@ -4181,7 +4164,7 @@
           <w:sz w:val="22"/>
           <w:szCs w:val="22"/>
         </w:rPr>
-        <w:t xml:space="preserve">Under overload, UDP threw away up to 38% of packets but kept delay low. TCP saved every packet and paid with steadily climbing delay. Neither wins outright — they are different trade-offs.</w:t>
+        <w:t xml:space="preserve">Overloaded, UDP dropped up to 38% of packets but stayed fast. TCP saved every packet but its delay kept climbing. Neither wins — you pick your trade-off.</w:t>
       </w:r>
     </w:p>
     <w:p>
@@ -4256,7 +4239,7 @@
           <w:sz w:val="22"/>
           <w:szCs w:val="22"/>
         </w:rPr>
-        <w:t xml:space="preserve">The project set out to connect queuing theory with simulation, and the numbers show it worked. Every scenario we tested landed within a couple of percent of the analytical prediction. The TCP-UDP comparison was the most interesting part: UDP is fast but careless, TCP is careful but slow under pressure, and watching both react to the same traffic makes a textbook idea feel concrete. With the web app, the CLI and the Colab notebook, anyone can reproduce every number in this report in a few minutes.</w:t>
+        <w:t xml:space="preserve">It worked. Every scenario landed within a couple percent of theory, so we trust both the simulator and the maths. The TCP-UDP result is the one worth remembering: UDP is fast but careless, TCP is careful but slow under pressure, and seeing both react to the same traffic makes the trade-off obvious in a way a textbook never quite does. Anyone can reproduce every number here in minutes from the web app, the CLI or the Colab notebook.</w:t>
       </w:r>
     </w:p>
     <w:p>
@@ -4292,7 +4275,7 @@
           <w:sz w:val="22"/>
           <w:szCs w:val="22"/>
         </w:rPr>
-        <w:t xml:space="preserve">Support non-Markovian models such as M/G/1, and bursty traffic.</w:t>
+        <w:t xml:space="preserve">Non-Markovian models (M/G/1) and bursty traffic.</w:t>
       </w:r>
     </w:p>
     <w:p>
@@ -4311,7 +4294,7 @@
           <w:sz w:val="22"/>
           <w:szCs w:val="22"/>
         </w:rPr>
-        <w:t xml:space="preserve">Add priority queues and scheduling policies.</w:t>
+        <w:t xml:space="preserve">Priority queues and scheduling policies.</w:t>
       </w:r>
     </w:p>
     <w:p>
@@ -4330,7 +4313,7 @@
           <w:sz w:val="22"/>
           <w:szCs w:val="22"/>
         </w:rPr>
-        <w:t xml:space="preserve">Use a more detailed TCP congestion-control model.</w:t>
+        <w:t xml:space="preserve">A more detailed TCP congestion-control model.</w:t>
       </w:r>
     </w:p>
     <w:p>
@@ -4349,7 +4332,7 @@
           <w:sz w:val="22"/>
           <w:szCs w:val="22"/>
         </w:rPr>
-        <w:t xml:space="preserve">Chain several queues together to model a full network path.</w:t>
+        <w:t xml:space="preserve">Chaining queues to model a full network path.</w:t>
       </w:r>
     </w:p>
     <w:p>
@@ -4390,7 +4373,7 @@
           <w:sz w:val="22"/>
           <w:szCs w:val="22"/>
         </w:rPr>
-        <w:t xml:space="preserve">[1] R. Jain, The Art of Computer Systems Performance Analysis. New York, NY, USA: Wiley, 1991.</w:t>
+        <w:t xml:space="preserve">[1] R. Jain, The Art of Computer Systems Performance Analysis. Wiley, 1991.</w:t>
       </w:r>
     </w:p>
     <w:p>
@@ -4405,7 +4388,7 @@
           <w:sz w:val="22"/>
           <w:szCs w:val="22"/>
         </w:rPr>
-        <w:t xml:space="preserve">[2] L. Kleinrock, Queueing Systems, Volume 1: Theory. New York, NY, USA: Wiley-Interscience, 1975.</w:t>
+        <w:t xml:space="preserve">[2] L. Kleinrock, Queueing Systems, Volume 1: Theory. Wiley-Interscience, 1975.</w:t>
       </w:r>
     </w:p>
     <w:p>
@@ -4420,7 +4403,7 @@
           <w:sz w:val="22"/>
           <w:szCs w:val="22"/>
         </w:rPr>
-        <w:t xml:space="preserve">[3] A. S. Tanenbaum and D. J. Wetherall, Computer Networks, 5th ed. Boston, MA, USA: Pearson, 2011.</w:t>
+        <w:t xml:space="preserve">[3] A. S. Tanenbaum and D. J. Wetherall, Computer Networks, 5th ed. Pearson, 2011.</w:t>
       </w:r>
     </w:p>
     <w:p>
@@ -4435,7 +4418,7 @@
           <w:sz w:val="22"/>
           <w:szCs w:val="22"/>
         </w:rPr>
-        <w:t xml:space="preserve">[4] J. F. Kurose and K. W. Ross, Computer Networking: A Top-Down Approach, 7th ed. Boston, MA, USA: Pearson, 2017.</w:t>
+        <w:t xml:space="preserve">[4] J. F. Kurose and K. W. Ross, Computer Networking: A Top-Down Approach, 7th ed. Pearson, 2017.</w:t>
       </w:r>
     </w:p>
     <w:p>
@@ -4450,7 +4433,7 @@
           <w:sz w:val="22"/>
           <w:szCs w:val="22"/>
         </w:rPr>
-        <w:t xml:space="preserve">[5] "SimPy Documentation," SimPy. [Online]. Available: https://simpy.readthedocs.io</w:t>
+        <w:t xml:space="preserve">[5] "SimPy Documentation." [Online]. Available: https://simpy.readthedocs.io</w:t>
       </w:r>
     </w:p>
     <w:p>
@@ -4465,7 +4448,7 @@
           <w:sz w:val="22"/>
           <w:szCs w:val="22"/>
         </w:rPr>
-        <w:t xml:space="preserve">[6] "NumPy and SciPy Documentation," Python Software Foundation. [Online]. Available: https://numpy.org</w:t>
+        <w:t xml:space="preserve">[6] "NumPy and SciPy Documentation." [Online]. Available: https://numpy.org</w:t>
       </w:r>
     </w:p>
     <w:sectPr>

</xml_diff>

<commit_message>
Reword report prose to natural first-person tone
</commit_message>
<xml_diff>
--- a/Network_Performance_Analyzer_Report.docx
+++ b/Network_Performance_Analyzer_Report.docx
@@ -494,7 +494,7 @@
           <w:sz w:val="22"/>
           <w:szCs w:val="22"/>
         </w:rPr>
-        <w:t xml:space="preserve">Networks slow down when they get busy. Packets pile up in router buffers, delay climbs, and past a point packets just get thrown away. We wanted to actually watch this happen instead of only reading formulas about it.</w:t>
+        <w:t xml:space="preserve">We picked this topic because queues show up everywhere in networking, and none of us had ever actually seen one behave. We had only solved problems about them on paper. The story itself is simple enough: a router has a buffer, traffic comes in faster than the link can drain it, the buffer fills, delay goes up, and after that packets start getting dropped.</w:t>
       </w:r>
     </w:p>
     <w:p>
@@ -509,7 +509,7 @@
           <w:sz w:val="22"/>
           <w:szCs w:val="22"/>
         </w:rPr>
-        <w:t xml:space="preserve">So we built a Python tool that simulates packet queues, measures throughput, delay and packet loss, and checks every number against what queuing theory says it should be. It also shows how TCP and UDP react when you overload the same link. If the simulation and the maths agree, we can trust both. They do.</w:t>
+        <w:t xml:space="preserve">What we built is a Python tool that plays this out packet by packet, then checks its own numbers against the queuing theory formulas. It also runs TCP and UDP over the same overloaded link to see how each one copes. If the simulation and the maths agree, both are probably right. They agree.</w:t>
       </w:r>
     </w:p>
     <w:p>
@@ -541,7 +541,7 @@
           <w:sz w:val="22"/>
           <w:szCs w:val="22"/>
         </w:rPr>
-        <w:t xml:space="preserve">Real hardware is expensive and no two test runs come out the same. Formulas are exact but too clean — they can't show a buffer actually overflowing. We wanted the middle ground: a simulator that behaves like a real queue, packet by packet, but proves itself against the maths.</w:t>
+        <w:t xml:space="preserve">Doing this on real hardware was never really an option for us, and even labs that have the hardware struggle to repeat an experiment exactly. The formula route has its own problem. Little's Law will happily give you the average delay, but it will not show you a buffer overflowing at double load. A simulator sits in the middle. It behaves like the real thing at packet level, and since the M/M/1 maths is exact, we can always check whether our simulator is lying to us.</w:t>
       </w:r>
     </w:p>
     <w:p>
@@ -685,7 +685,7 @@
           <w:sz w:val="22"/>
           <w:szCs w:val="22"/>
         </w:rPr>
-        <w:t xml:space="preserve">Made for students learning performance engineering. It runs three ways — a web dashboard, a command-line menu, and a Colab notebook that needs zero setup. Every graph in this report can be reproduced in minutes.</w:t>
+        <w:t xml:space="preserve">This is a lab project, so the audience is mostly us and whoever takes this course next. We still put real effort into making it easy to run. There is a web dashboard with sliders, a command-line menu, and a Colab notebook — that last one needs zero setup, it just runs in the browser. Every graph in this report can be reproduced in a few minutes.</w:t>
       </w:r>
     </w:p>
     <w:p>
@@ -760,7 +760,7 @@
           <w:sz w:val="22"/>
           <w:szCs w:val="22"/>
         </w:rPr>
-        <w:t xml:space="preserve">Queuing theory is the maths of waiting lines. M/M/1 means Poisson arrivals, exponential service, one server. M/M/c adds servers. M/M/c/K caps the buffer at K packets — that cap is where packet loss comes from. Two results do the heavy lifting for us: Little's Law (L = λ·W) ties the number of packets in the system to the time each one spends there, and Erlang-C gives the chance a packet has to wait. Both are exact. That makes them perfect for checking a simulator.</w:t>
+        <w:t xml:space="preserve">The notation takes a minute to get used to, but the idea underneath is ordinary. M/M/1: arrivals are Poisson, service times are exponential, one server. M/M/c is the same thing with c servers. M/M/c/K adds a hard cap of K packets in the system, and that cap is what creates packet loss — a packet arriving at a full system has nowhere to go. We lean on two exact results. Little's Law, L = λ·W. And Erlang-C, which gives the probability that an arriving packet finds every server busy. The fact that both are exact is the whole reason validation works. There is no error bar to hide behind.</w:t>
       </w:r>
     </w:p>
     <w:p>
@@ -792,7 +792,7 @@
           <w:sz w:val="22"/>
           <w:szCs w:val="22"/>
         </w:rPr>
-        <w:t xml:space="preserve">A discrete-event simulator doesn't tick a clock. It jumps between events — packet arrives, server frees up, packet leaves — and SimPy handles all the scheduling. The payoff is realism: it drops packets from a full buffer exactly like a real router would, which is the one thing formulas can't show you.</w:t>
+        <w:t xml:space="preserve">SimPy does the actual simulation work. It is event based, so instead of ticking time forward it jumps: arrival, service start, departure, next arrival. That sounds like an implementation detail. It is actually why the whole thing is fast — thousands of simulated seconds finish in a moment — and why it can drop packets from a full buffer the same way a router does, which no formula shows you directly.</w:t>
       </w:r>
     </w:p>
     <w:p>
@@ -1973,7 +1973,7 @@
           <w:sz w:val="22"/>
           <w:szCs w:val="22"/>
         </w:rPr>
-        <w:t xml:space="preserve">The whole thing is a pipeline of small modules. Each does one job and passes plain data to the next, so the simulation, the maths and the plotting never get tangled up.</w:t>
+        <w:t xml:space="preserve">We kept the code split into small files on purpose, mostly because it made debugging bearable. Each module does one job and hands plain data to the next one, so the simulation, the maths and the plotting never get tangled up in each other.</w:t>
       </w:r>
     </w:p>
     <w:p>
@@ -2499,7 +2499,7 @@
           <w:sz w:val="22"/>
           <w:szCs w:val="22"/>
         </w:rPr>
-        <w:t xml:space="preserve">The core is a SimPy resource with c servers. Packets show up with random exponential gaps, grab a server, hold it for a random service time, and leave. System already full? The new packet is dropped. That single rule is our whole model of buffer overflow, and it's enough. Every packet gets logged — when it came, how long it waited, whether it survived — and the metrics fall straight out of that log. Same seed, same result, every single time.</w:t>
+        <w:t xml:space="preserve">The engine itself is short. A SimPy resource with capacity c is the server pool. The arrival loop draws an exponential gap, creates a packet, checks occupancy — and if the system already holds K packets, the new one is marked dropped and that is it. That is the entire buffer overflow model. Every served packet logs four things: when it arrived, how long it waited, its total time in the system, and the fact that it made it out. Pandas turns the log into a table and the metrics come from a handful of lines on top of that. One thing we insisted on early was seeded randomness. Run any scenario twice and you get identical output, down to the last decimal.</w:t>
       </w:r>
     </w:p>
     <w:p>
@@ -2531,7 +2531,7 @@
           <w:sz w:val="22"/>
           <w:szCs w:val="22"/>
         </w:rPr>
-        <w:t xml:space="preserve">Everything is on GitHub. The dashboard runs live at network-performance-analyzer.streamlit.app, the notebook opens straight in Colab, and pushing to main redeploys the app automatically. Nothing to install.</w:t>
+        <w:t xml:space="preserve">The repo is public on GitHub. Streamlit Community Cloud watches the main branch and rebuilds the dashboard whenever we push, which saved us a lot of works-on-my-machine arguments. The live app is at network-performance-analyzer.streamlit.app, and the Colab notebook opens straight from a link in the README. Nothing to install anywhere.</w:t>
       </w:r>
     </w:p>
     <w:p>
@@ -3162,7 +3162,7 @@
           <w:sz w:val="22"/>
           <w:szCs w:val="22"/>
         </w:rPr>
-        <w:t xml:space="preserve">This is the heart of the project. Every run prints its measured numbers next to the maths. These came from actual runs:</w:t>
+        <w:t xml:space="preserve">Every run prints its measured numbers next to the theory. Here are five of them, straight from real runs, not cherry picked. The M/M/2/6 loss line was the one we were most nervous about, and it came out fine.</w:t>
       </w:r>
     </w:p>
     <w:tbl>
@@ -4107,7 +4107,7 @@
           <w:sz w:val="22"/>
           <w:szCs w:val="22"/>
         </w:rPr>
-        <w:t xml:space="preserve">Simulation and theory agree within 1-2% everywhere we checked.</w:t>
+        <w:t xml:space="preserve">Agreement with theory was 1-2% everywhere, sometimes better.</w:t>
       </w:r>
     </w:p>
     <w:p>
@@ -4126,7 +4126,7 @@
           <w:sz w:val="22"/>
           <w:szCs w:val="22"/>
         </w:rPr>
-        <w:t xml:space="preserve">Delay stays flat, then explodes as ρ approaches 1. That's the queuing knee.</w:t>
+        <w:t xml:space="preserve">The delay curve has a knee. Flat, flat, flat, then almost straight up once ρ gets near 1.</w:t>
       </w:r>
     </w:p>
     <w:p>
@@ -4145,7 +4145,7 @@
           <w:sz w:val="22"/>
           <w:szCs w:val="22"/>
         </w:rPr>
-        <w:t xml:space="preserve">Two or three servers beat one server badly at the same per-server load.</w:t>
+        <w:t xml:space="preserve">Going from one server to two at the same per-server load cut delay by more than half. A third server helped less. Diminishing returns, basically.</w:t>
       </w:r>
     </w:p>
     <w:p>
@@ -4164,7 +4164,7 @@
           <w:sz w:val="22"/>
           <w:szCs w:val="22"/>
         </w:rPr>
-        <w:t xml:space="preserve">Overloaded, UDP dropped up to 38% of packets but stayed fast. TCP saved every packet but its delay kept climbing. Neither wins — you pick your trade-off.</w:t>
+        <w:t xml:space="preserve">The overload test was the fun one. UDP kept its delay low and quietly lost up to 38% of everything we sent. TCP delivered every single packet, but its delay kept climbing the whole time.</w:t>
       </w:r>
     </w:p>
     <w:p>
@@ -4239,7 +4239,7 @@
           <w:sz w:val="22"/>
           <w:szCs w:val="22"/>
         </w:rPr>
-        <w:t xml:space="preserve">It worked. Every scenario landed within a couple percent of theory, so we trust both the simulator and the maths. The TCP-UDP result is the one worth remembering: UDP is fast but careless, TCP is careful but slow under pressure, and seeing both react to the same traffic makes the trade-off obvious in a way a textbook never quite does. Anyone can reproduce every number here in minutes from the web app, the CLI or the Colab notebook.</w:t>
+        <w:t xml:space="preserve">The plan was to connect the formulas from class to something we could actually run, and that part worked out. The numbers match. Close enough that whenever they did not match early on, the bug turned out to be in our code, never in the theory — which is a lesson in itself. If we had to pick one takeaway it would be the TCP versus UDP graph. Reliability is not free. You pay for it in delay, and now we have measured exactly how much. Everything in this report can be re-run in a few minutes from the web app, the command line or the Colab notebook.</w:t>
       </w:r>
     </w:p>
     <w:p>

</xml_diff>